<commit_message>
MOO-190: correct the routing table — the MOO-186 disagreement is recorded, not posted to a done issue
Co-Authored-By: Claude Opus 5 <noreply@anthropic.com>
</commit_message>
<xml_diff>
--- a/moo190-disposition.docx
+++ b/moo190-disposition.docx
@@ -3765,7 +3765,13 @@
           </w:tcPr>
           <w:p>
             <w:r>
-              <w:t>Posted. Not a gate.</w:t>
+              <w:rPr>
+                <w:b/>
+              </w:rPr>
+              <w:t>Recorded here and in the MOO-190 disposition comment. MOO-186 is `done` and I am not reopening it to argue a point the cut settles.</w:t>
+            </w:r>
+            <w:r>
+              <w:t xml:space="preserve"> The pass has already posted its own disagreement there.</w:t>
             </w:r>
           </w:p>
         </w:tc>

</xml_diff>